<commit_message>
Adjusting the final analytical sample size to deal with missing URM status.
</commit_message>
<xml_diff>
--- a/Reports/SOW_Hengeveld.docx
+++ b/Reports/SOW_Hengeveld.docx
@@ -170,7 +170,6 @@
                 <w:rFonts w:cs="Arial"/>
               </w:rPr>
             </w:pPr>
-            <w:proofErr w:type="gramStart"/>
             <w:r>
               <w:rPr>
                 <w:rFonts w:cs="Arial"/>
@@ -189,7 +188,6 @@
               </w:rPr>
               <w:t>5</w:t>
             </w:r>
-            <w:proofErr w:type="gramEnd"/>
             <w:r>
               <w:rPr>
                 <w:rFonts w:cs="Arial"/>
@@ -577,23 +575,7 @@
           <w:sz w:val="20"/>
           <w:szCs w:val="20"/>
         </w:rPr>
-        <w:t xml:space="preserve">Park, W. B., Kang, S. H., Lee, Y. S., &amp; Myung, S. J. (2015). Does Objective Structured Clinical Examinations Score Reflect the Clinical Reasoning Ability of Medical </w:t>
-      </w:r>
-      <w:proofErr w:type="gramStart"/>
-      <w:r>
-        <w:rPr>
-          <w:sz w:val="20"/>
-          <w:szCs w:val="20"/>
-        </w:rPr>
-        <w:t>Students?.</w:t>
-      </w:r>
-      <w:proofErr w:type="gramEnd"/>
-      <w:r>
-        <w:rPr>
-          <w:sz w:val="20"/>
-          <w:szCs w:val="20"/>
-        </w:rPr>
-        <w:t xml:space="preserve"> </w:t>
+        <w:t xml:space="preserve">Park, W. B., Kang, S. H., Lee, Y. S., &amp; Myung, S. J. (2015). Does Objective Structured Clinical Examinations Score Reflect the Clinical Reasoning Ability of Medical Students?. </w:t>
       </w:r>
       <w:r>
         <w:rPr>
@@ -685,11 +667,7 @@
         <w:t>the</w:t>
       </w:r>
       <w:r>
-        <w:t xml:space="preserve"> class </w:t>
-      </w:r>
-      <w:proofErr w:type="gramStart"/>
-      <w:r>
-        <w:t xml:space="preserve">of </w:t>
+        <w:t xml:space="preserve"> class of </w:t>
       </w:r>
       <w:r>
         <w:t xml:space="preserve"> 20</w:t>
@@ -697,7 +675,6 @@
       <w:r>
         <w:t>20</w:t>
       </w:r>
-      <w:proofErr w:type="gramEnd"/>
       <w:r>
         <w:t xml:space="preserve">  at the school of medicine. </w:t>
       </w:r>
@@ -757,21 +734,7 @@
         <w:rPr>
           <w:rFonts w:cs="Arial"/>
         </w:rPr>
-        <w:t xml:space="preserve">Data was gathered across different resources and databases at the School of Medicine and combined </w:t>
-      </w:r>
-      <w:proofErr w:type="gramStart"/>
-      <w:r>
-        <w:rPr>
-          <w:rFonts w:cs="Arial"/>
-        </w:rPr>
-        <w:t>by</w:t>
-      </w:r>
-      <w:proofErr w:type="gramEnd"/>
-      <w:r>
-        <w:rPr>
-          <w:rFonts w:cs="Arial"/>
-        </w:rPr>
-        <w:t xml:space="preserve"> Student ID. </w:t>
+        <w:t xml:space="preserve">Data was gathered across different resources and databases at the School of Medicine and combined by Student ID. </w:t>
       </w:r>
       <w:r>
         <w:rPr>
@@ -894,21 +857,13 @@
         <w:t>P</w:t>
       </w:r>
       <w:r>
-        <w:t>1or</w:t>
-      </w:r>
-      <w:proofErr w:type="gramStart"/>
-      <w:r>
-        <w:t>2</w:t>
+        <w:t>1or2</w:t>
       </w:r>
       <w:r>
         <w:t>]</w:t>
       </w:r>
       <w:r>
-        <w:t>[</w:t>
-      </w:r>
-      <w:proofErr w:type="gramEnd"/>
-      <w:r>
-        <w:t>Season][</w:t>
+        <w:t>[Season][</w:t>
       </w:r>
       <w:proofErr w:type="spellStart"/>
       <w:r>
@@ -943,6 +898,20 @@
       </w:r>
       <w:r>
         <w:t xml:space="preserve">, leaving an analytical sample size of 160 students. </w:t>
+      </w:r>
+    </w:p>
+    <w:p>
+      <w:r>
+        <w:t xml:space="preserve">Additionally, </w:t>
+      </w:r>
+      <w:r>
+        <w:t xml:space="preserve">after reducing the dataset to those with at least 1 OSCE score, </w:t>
+      </w:r>
+      <w:r>
+        <w:t xml:space="preserve">there are 6 </w:t>
+      </w:r>
+      <w:r>
+        <w:t xml:space="preserve">students with no available data for their race and ethnicity, currently coded as “unknown” for URM status. These must also be removed from the sample, as URM status is the primary explanatory variable. The final analytical sample size is 154. </w:t>
       </w:r>
     </w:p>
     <w:p>
@@ -1027,19 +996,11 @@
         </w:rPr>
         <w:t xml:space="preserve">school across all disciplines. Inclusion criteria </w:t>
       </w:r>
-      <w:proofErr w:type="gramStart"/>
       <w:r>
         <w:rPr>
           <w:rFonts w:cs="Arial"/>
         </w:rPr>
-        <w:t>is</w:t>
-      </w:r>
-      <w:proofErr w:type="gramEnd"/>
-      <w:r>
-        <w:rPr>
-          <w:rFonts w:cs="Arial"/>
-        </w:rPr>
-        <w:t xml:space="preserve"> students enrolled in the University of Colorado School of Medicine, class of 2020.</w:t>
+        <w:t>is students enrolled in the University of Colorado School of Medicine, class of 2020.</w:t>
       </w:r>
       <w:r>
         <w:rPr>
@@ -1160,6 +1121,7 @@
     </w:p>
     <w:p>
       <w:r>
+        <w:lastRenderedPageBreak/>
         <w:t>As these are exploratory analyses</w:t>
       </w:r>
       <w:r>
@@ -1208,11 +1170,7 @@
       </w:r>
       <w:proofErr w:type="spellEnd"/>
       <w:r>
-        <w:t xml:space="preserve"> </w:t>
-      </w:r>
-      <w:r>
-        <w:lastRenderedPageBreak/>
-        <w:t>between URM students and non-URM students.</w:t>
+        <w:t xml:space="preserve"> between URM students and non-URM students.</w:t>
       </w:r>
       <w:r>
         <w:t xml:space="preserve"> </w:t>

</xml_diff>